<commit_message>
Update CV to latest version and add LLM-agent evaluation harness to site
- Replace old CV with updated April 2026 .docx
- Add 'Automated LLM-agent evaluation harnesses & CI regression gating'
  to AI & Generative AI skills card
- Add 'Designed an automated evaluation harness that gates LLM-agent
  behaviour regressions in CI' to Agent Platform experience

Co-Authored-By: Claude Opus 4.7 (1M context) <noreply@anthropic.com>
</commit_message>
<xml_diff>
--- a/Stephen Edwards CV-April-2026.docx
+++ b/Stephen Edwards CV-April-2026.docx
@@ -121,6 +121,41 @@
         </w:rPr>
         <w:t xml:space="preserve">Languages: English (Native) </w:t>
       </w:r>
+    </w:p>
+    <w:p>
+      <w:pPr>
+        <w:pStyle w:val="NoSpacing"/>
+        <w:rPr>
+          <w:rFonts w:cstheme="minorHAnsi"/>
+        </w:rPr>
+      </w:pPr>
+      <w:r>
+        <w:rPr>
+          <w:rFonts w:cstheme="minorHAnsi"/>
+        </w:rPr>
+        <w:t>Websi</w:t>
+      </w:r>
+      <w:r>
+        <w:rPr>
+          <w:rFonts w:cstheme="minorHAnsi"/>
+        </w:rPr>
+        <w:t xml:space="preserve">te: </w:t>
+      </w:r>
+      <w:r>
+        <w:rPr>
+          <w:rFonts w:cstheme="minorHAnsi"/>
+        </w:rPr>
+        <w:tab/>
+      </w:r>
+      <w:hyperlink r:id="rId8" w:history="1">
+        <w:r>
+          <w:rPr>
+            <w:rStyle w:val="Hyperlink"/>
+            <w:rFonts w:cstheme="minorHAnsi"/>
+          </w:rPr>
+          <w:t>https://stephendenisedwards.github.io/stephen-edwards-ws/</w:t>
+        </w:r>
+      </w:hyperlink>
     </w:p>
     <w:p>
       <w:pPr>
@@ -1744,6 +1779,44 @@
         </w:rPr>
         <w:t>Real-time AI systems and streaming architectures</w:t>
       </w:r>
+    </w:p>
+    <w:p>
+      <w:pPr>
+        <w:pStyle w:val="NoSpacing"/>
+        <w:numPr>
+          <w:ilvl w:val="0"/>
+          <w:numId w:val="29"/>
+        </w:numPr>
+        <w:rPr>
+          <w:sz w:val="18"/>
+          <w:szCs w:val="18"/>
+          <w:lang w:eastAsia="en-GB"/>
+        </w:rPr>
+      </w:pPr>
+      <w:r>
+        <w:rPr>
+          <w:sz w:val="18"/>
+          <w:szCs w:val="18"/>
+          <w:lang w:eastAsia="en-GB"/>
+        </w:rPr>
+        <w:t>Designed an</w:t>
+      </w:r>
+      <w:r>
+        <w:rPr>
+          <w:sz w:val="18"/>
+          <w:szCs w:val="18"/>
+          <w:lang w:eastAsia="en-GB"/>
+        </w:rPr>
+        <w:t>d</w:t>
+      </w:r>
+      <w:r>
+        <w:rPr>
+          <w:sz w:val="18"/>
+          <w:szCs w:val="18"/>
+          <w:lang w:eastAsia="en-GB"/>
+        </w:rPr>
+        <w:t xml:space="preserve"> automated evaluation harness that gates LLM-agent behaviour regressions in CI</w:t>
+      </w:r>
       <w:r>
         <w:rPr>
           <w:sz w:val="18"/>
@@ -2126,6 +2199,7 @@
           <w:szCs w:val="18"/>
           <w:lang w:eastAsia="en-GB"/>
         </w:rPr>
+        <w:lastRenderedPageBreak/>
         <w:t>Protocols &amp; Messaging:</w:t>
       </w:r>
       <w:r>
@@ -2198,7 +2272,6 @@
           <w:szCs w:val="18"/>
           <w:lang w:eastAsia="en-GB"/>
         </w:rPr>
-        <w:lastRenderedPageBreak/>
         <w:t>Web &amp; UI Frameworks:</w:t>
       </w:r>
       <w:r>
@@ -3228,6 +3301,7 @@
         <w:rPr>
           <w:lang w:eastAsia="en-GB"/>
         </w:rPr>
+        <w:lastRenderedPageBreak/>
         <w:t>web search, WhatsApp) with structured JSON output and Zod validation. Implemented multi-provider</w:t>
       </w:r>
     </w:p>
@@ -3278,7 +3352,6 @@
         <w:rPr>
           <w:lang w:eastAsia="en-GB"/>
         </w:rPr>
-        <w:lastRenderedPageBreak/>
         <w:t>on-demand tool discovery. Maintained 15+ ADRs and a full Software Architecture Document.</w:t>
       </w:r>
     </w:p>
@@ -3743,6 +3816,7 @@
           <w:bCs/>
           <w:lang w:eastAsia="en-GB"/>
         </w:rPr>
+        <w:lastRenderedPageBreak/>
         <w:t>Physical Data Segregation:</w:t>
       </w:r>
       <w:r>
@@ -3793,7 +3867,6 @@
         <w:rPr>
           <w:lang w:eastAsia="en-GB"/>
         </w:rPr>
-        <w:lastRenderedPageBreak/>
         <w:t>Compliance &amp; Interoperability: Embedded GDPR, provenance, auditability and data-minimisation requirements directly into cloud and integration designs. Established schema-evolution and message governance standards.</w:t>
       </w:r>
     </w:p>
@@ -4441,7 +4514,14 @@
         <w:rPr>
           <w:lang w:eastAsia="en-GB"/>
         </w:rPr>
-        <w:t xml:space="preserve"> Advocated for developer productivity by introducing clear interface contracts, improving documentation, and supporting onboarding and knowledge sharing. Championed a culture of technical ownership and continuous improvement.</w:t>
+        <w:t xml:space="preserve"> Advocated for developer productivity by introducing clear interface contracts, </w:t>
+      </w:r>
+      <w:r>
+        <w:rPr>
+          <w:lang w:eastAsia="en-GB"/>
+        </w:rPr>
+        <w:lastRenderedPageBreak/>
+        <w:t>improving documentation, and supporting onboarding and knowledge sharing. Championed a culture of technical ownership and continuous improvement.</w:t>
       </w:r>
     </w:p>
     <w:p>
@@ -4627,7 +4707,6 @@
           <w:bCs/>
           <w:lang w:eastAsia="en-GB"/>
         </w:rPr>
-        <w:lastRenderedPageBreak/>
         <w:t>AI-Powered Information Retrieval (RAG):</w:t>
       </w:r>
       <w:r>
@@ -5426,6 +5505,7 @@
           <w:color w:val="000000"/>
           <w:lang w:eastAsia="en-GB"/>
         </w:rPr>
+        <w:lastRenderedPageBreak/>
         <w:t xml:space="preserve">Led the design and implementation of a </w:t>
       </w:r>
       <w:r>
@@ -5552,7 +5632,6 @@
         <w:rPr>
           <w:lang w:eastAsia="en-GB"/>
         </w:rPr>
-        <w:lastRenderedPageBreak/>
         <w:t>Built a CNN-powered image processing pipeline using Python, TensorFlow/</w:t>
       </w:r>
       <w:proofErr w:type="spellStart"/>
@@ -6112,6 +6191,7 @@
         <w:rPr>
           <w:lang w:eastAsia="en-GB"/>
         </w:rPr>
+        <w:lastRenderedPageBreak/>
         <w:t>Led a feasibility study and prototyping effort for a low-cost wearable contact tracing device using Ultra-Wideband (UWB) for infrastructure-less peer-to-peer ranging.</w:t>
       </w:r>
     </w:p>
@@ -6203,7 +6283,6 @@
           <w:color w:val="000000"/>
           <w:lang w:eastAsia="en-GB"/>
         </w:rPr>
-        <w:lastRenderedPageBreak/>
         <w:t>Technologies:</w:t>
       </w:r>
       <w:r>
@@ -7177,6 +7256,7 @@
           <w:color w:val="000000"/>
           <w:lang w:eastAsia="en-GB"/>
         </w:rPr>
+        <w:lastRenderedPageBreak/>
         <w:t>C#, .NET Core, .NET Framework, ASP.NET Core MVC, WPF, WCF, Web API, REST + HATEOAS, OData, Angular, TypeScript, JavaScript</w:t>
       </w:r>
       <w:r>
@@ -8494,6 +8574,7 @@
           <w:sz w:val="20"/>
           <w:szCs w:val="20"/>
         </w:rPr>
+        <w:lastRenderedPageBreak/>
         <w:t>C++, C++11, C, MASM, STL, Boost, MFC, WPF, Win32, CodeJock, Node.js/Nan, Express.js, Angular 2, JavaScript (ES6/TypeScript), ASP.NET MVC 5</w:t>
       </w:r>
       <w:r>
@@ -8665,16 +8746,7 @@
           <w:color w:val="000000"/>
           <w:lang w:eastAsia="en-GB"/>
         </w:rPr>
-        <w:t xml:space="preserve">, delivering secure, performant, and interoperable solutions for data acquisition, workflow </w:t>
-      </w:r>
-      <w:r>
-        <w:rPr>
-          <w:rFonts w:eastAsia="Times New Roman" w:cstheme="minorHAnsi"/>
-          <w:color w:val="000000"/>
-          <w:lang w:eastAsia="en-GB"/>
-        </w:rPr>
-        <w:lastRenderedPageBreak/>
-        <w:t>management, and system integration across clinical environments. Focused on performance, scalability, interoperability, and maintainability in line with industry standards (</w:t>
+        <w:t>, delivering secure, performant, and interoperable solutions for data acquisition, workflow management, and system integration across clinical environments. Focused on performance, scalability, interoperability, and maintainability in line with industry standards (</w:t>
       </w:r>
       <w:r>
         <w:rPr>
@@ -9326,6 +9398,7 @@
           <w:color w:val="000000"/>
           <w:lang w:eastAsia="en-GB"/>
         </w:rPr>
+        <w:lastRenderedPageBreak/>
         <w:t xml:space="preserve">Implemented high-performance data serialization using </w:t>
       </w:r>
       <w:r>
@@ -9469,7 +9542,6 @@
         <w:pStyle w:val="Heading1"/>
       </w:pPr>
       <w:r>
-        <w:lastRenderedPageBreak/>
         <w:t>January 2012 – January 2013 (1 yr)</w:t>
       </w:r>
     </w:p>
@@ -10638,7 +10710,6 @@
           <w:color w:val="000000"/>
           <w:lang w:eastAsia="en-GB"/>
         </w:rPr>
-        <w:lastRenderedPageBreak/>
         <w:t xml:space="preserve">Designed dynamic and interactive UIs using </w:t>
       </w:r>
       <w:r>
@@ -11093,12 +11164,7 @@
       </w:r>
     </w:p>
     <w:sectPr>
-      <w:headerReference w:type="even" r:id="rId8"/>
       <w:headerReference w:type="default" r:id="rId9"/>
-      <w:footerReference w:type="even" r:id="rId10"/>
-      <w:footerReference w:type="default" r:id="rId11"/>
-      <w:headerReference w:type="first" r:id="rId12"/>
-      <w:footerReference w:type="first" r:id="rId13"/>
       <w:type w:val="continuous"/>
       <w:pgSz w:w="11906" w:h="16838"/>
       <w:pgMar w:top="1440" w:right="1440" w:bottom="1440" w:left="1440" w:header="708" w:footer="708" w:gutter="0"/>
@@ -11141,36 +11207,6 @@
 </w:endnotes>
 </file>
 
-<file path=word/footer1.xml><?xml version="1.0" encoding="utf-8"?>
-<w:ftr xmlns:wpc="http://schemas.microsoft.com/office/word/2010/wordprocessingCanvas" xmlns:cx="http://schemas.microsoft.com/office/drawing/2014/chartex" xmlns:cx1="http://schemas.microsoft.com/office/drawing/2015/9/8/chartex" xmlns:cx2="http://schemas.microsoft.com/office/drawing/2015/10/21/chartex" xmlns:cx3="http://schemas.microsoft.com/office/drawing/2016/5/9/chartex" xmlns:cx4="http://schemas.microsoft.com/office/drawing/2016/5/10/chartex" xmlns:cx5="http://schemas.microsoft.com/office/drawing/2016/5/11/chartex" xmlns:cx6="http://schemas.microsoft.com/office/drawing/2016/5/12/chartex" xmlns:cx7="http://schemas.microsoft.com/office/drawing/2016/5/13/chartex" xmlns:cx8="http://schemas.microsoft.com/office/drawing/2016/5/14/chartex" xmlns:mc="http://schemas.openxmlformats.org/markup-compatibility/2006" xmlns:aink="http://schemas.microsoft.com/office/drawing/2016/ink" xmlns:am3d="http://schemas.microsoft.com/office/drawing/2017/model3d" xmlns:o="urn:schemas-microsoft-com:office:office" xmlns:oel="http://schemas.microsoft.com/office/2019/extlst" xmlns:r="http://schemas.openxmlformats.org/officeDocument/2006/relationships" xmlns:m="http://schemas.openxmlformats.org/officeDocument/2006/math" xmlns:v="urn:schemas-microsoft-com:vml" xmlns:wp14="http://schemas.microsoft.com/office/word/2010/wordprocessingDrawing" xmlns:wp="http://schemas.openxmlformats.org/drawingml/2006/wordprocessingDrawing" xmlns:w10="urn:schemas-microsoft-com:office:word" xmlns:w="http://schemas.openxmlformats.org/wordprocessingml/2006/main" xmlns:w14="http://schemas.microsoft.com/office/word/2010/wordml" xmlns:w15="http://schemas.microsoft.com/office/word/2012/wordml" xmlns:w16cex="http://schemas.microsoft.com/office/word/2018/wordml/cex" xmlns:w16cid="http://schemas.microsoft.com/office/word/2016/wordml/cid" xmlns:w16="http://schemas.microsoft.com/office/word/2018/wordml" xmlns:w16du="http://schemas.microsoft.com/office/word/2023/wordml/word16du" xmlns:w16sdtdh="http://schemas.microsoft.com/office/word/2020/wordml/sdtdatahash" xmlns:w16sdtfl="http://schemas.microsoft.com/office/word/2024/wordml/sdtformatlock" xmlns:w16se="http://schemas.microsoft.com/office/word/2015/wordml/symex" xmlns:wpg="http://schemas.microsoft.com/office/word/2010/wordprocessingGroup" xmlns:wpi="http://schemas.microsoft.com/office/word/2010/wordprocessingInk" xmlns:wne="http://schemas.microsoft.com/office/word/2006/wordml" xmlns:wps="http://schemas.microsoft.com/office/word/2010/wordprocessingShape" mc:Ignorable="w14 w15 w16se w16cid w16 w16cex w16sdtdh w16sdtfl w16du wp14">
-  <w:p>
-    <w:pPr>
-      <w:pStyle w:val="Footer"/>
-    </w:pPr>
-  </w:p>
-</w:ftr>
-</file>
-
-<file path=word/footer2.xml><?xml version="1.0" encoding="utf-8"?>
-<w:ftr xmlns:wpc="http://schemas.microsoft.com/office/word/2010/wordprocessingCanvas" xmlns:cx="http://schemas.microsoft.com/office/drawing/2014/chartex" xmlns:cx1="http://schemas.microsoft.com/office/drawing/2015/9/8/chartex" xmlns:cx2="http://schemas.microsoft.com/office/drawing/2015/10/21/chartex" xmlns:cx3="http://schemas.microsoft.com/office/drawing/2016/5/9/chartex" xmlns:cx4="http://schemas.microsoft.com/office/drawing/2016/5/10/chartex" xmlns:cx5="http://schemas.microsoft.com/office/drawing/2016/5/11/chartex" xmlns:cx6="http://schemas.microsoft.com/office/drawing/2016/5/12/chartex" xmlns:cx7="http://schemas.microsoft.com/office/drawing/2016/5/13/chartex" xmlns:cx8="http://schemas.microsoft.com/office/drawing/2016/5/14/chartex" xmlns:mc="http://schemas.openxmlformats.org/markup-compatibility/2006" xmlns:aink="http://schemas.microsoft.com/office/drawing/2016/ink" xmlns:am3d="http://schemas.microsoft.com/office/drawing/2017/model3d" xmlns:o="urn:schemas-microsoft-com:office:office" xmlns:oel="http://schemas.microsoft.com/office/2019/extlst" xmlns:r="http://schemas.openxmlformats.org/officeDocument/2006/relationships" xmlns:m="http://schemas.openxmlformats.org/officeDocument/2006/math" xmlns:v="urn:schemas-microsoft-com:vml" xmlns:wp14="http://schemas.microsoft.com/office/word/2010/wordprocessingDrawing" xmlns:wp="http://schemas.openxmlformats.org/drawingml/2006/wordprocessingDrawing" xmlns:w10="urn:schemas-microsoft-com:office:word" xmlns:w="http://schemas.openxmlformats.org/wordprocessingml/2006/main" xmlns:w14="http://schemas.microsoft.com/office/word/2010/wordml" xmlns:w15="http://schemas.microsoft.com/office/word/2012/wordml" xmlns:w16cex="http://schemas.microsoft.com/office/word/2018/wordml/cex" xmlns:w16cid="http://schemas.microsoft.com/office/word/2016/wordml/cid" xmlns:w16="http://schemas.microsoft.com/office/word/2018/wordml" xmlns:w16du="http://schemas.microsoft.com/office/word/2023/wordml/word16du" xmlns:w16sdtdh="http://schemas.microsoft.com/office/word/2020/wordml/sdtdatahash" xmlns:w16sdtfl="http://schemas.microsoft.com/office/word/2024/wordml/sdtformatlock" xmlns:w16se="http://schemas.microsoft.com/office/word/2015/wordml/symex" xmlns:wpg="http://schemas.microsoft.com/office/word/2010/wordprocessingGroup" xmlns:wpi="http://schemas.microsoft.com/office/word/2010/wordprocessingInk" xmlns:wne="http://schemas.microsoft.com/office/word/2006/wordml" xmlns:wps="http://schemas.microsoft.com/office/word/2010/wordprocessingShape" mc:Ignorable="w14 w15 w16se w16cid w16 w16cex w16sdtdh w16sdtfl w16du wp14">
-  <w:p>
-    <w:pPr>
-      <w:pStyle w:val="Footer"/>
-    </w:pPr>
-  </w:p>
-</w:ftr>
-</file>
-
-<file path=word/footer3.xml><?xml version="1.0" encoding="utf-8"?>
-<w:ftr xmlns:wpc="http://schemas.microsoft.com/office/word/2010/wordprocessingCanvas" xmlns:cx="http://schemas.microsoft.com/office/drawing/2014/chartex" xmlns:cx1="http://schemas.microsoft.com/office/drawing/2015/9/8/chartex" xmlns:cx2="http://schemas.microsoft.com/office/drawing/2015/10/21/chartex" xmlns:cx3="http://schemas.microsoft.com/office/drawing/2016/5/9/chartex" xmlns:cx4="http://schemas.microsoft.com/office/drawing/2016/5/10/chartex" xmlns:cx5="http://schemas.microsoft.com/office/drawing/2016/5/11/chartex" xmlns:cx6="http://schemas.microsoft.com/office/drawing/2016/5/12/chartex" xmlns:cx7="http://schemas.microsoft.com/office/drawing/2016/5/13/chartex" xmlns:cx8="http://schemas.microsoft.com/office/drawing/2016/5/14/chartex" xmlns:mc="http://schemas.openxmlformats.org/markup-compatibility/2006" xmlns:aink="http://schemas.microsoft.com/office/drawing/2016/ink" xmlns:am3d="http://schemas.microsoft.com/office/drawing/2017/model3d" xmlns:o="urn:schemas-microsoft-com:office:office" xmlns:oel="http://schemas.microsoft.com/office/2019/extlst" xmlns:r="http://schemas.openxmlformats.org/officeDocument/2006/relationships" xmlns:m="http://schemas.openxmlformats.org/officeDocument/2006/math" xmlns:v="urn:schemas-microsoft-com:vml" xmlns:wp14="http://schemas.microsoft.com/office/word/2010/wordprocessingDrawing" xmlns:wp="http://schemas.openxmlformats.org/drawingml/2006/wordprocessingDrawing" xmlns:w10="urn:schemas-microsoft-com:office:word" xmlns:w="http://schemas.openxmlformats.org/wordprocessingml/2006/main" xmlns:w14="http://schemas.microsoft.com/office/word/2010/wordml" xmlns:w15="http://schemas.microsoft.com/office/word/2012/wordml" xmlns:w16cex="http://schemas.microsoft.com/office/word/2018/wordml/cex" xmlns:w16cid="http://schemas.microsoft.com/office/word/2016/wordml/cid" xmlns:w16="http://schemas.microsoft.com/office/word/2018/wordml" xmlns:w16du="http://schemas.microsoft.com/office/word/2023/wordml/word16du" xmlns:w16sdtdh="http://schemas.microsoft.com/office/word/2020/wordml/sdtdatahash" xmlns:w16sdtfl="http://schemas.microsoft.com/office/word/2024/wordml/sdtformatlock" xmlns:w16se="http://schemas.microsoft.com/office/word/2015/wordml/symex" xmlns:wpg="http://schemas.microsoft.com/office/word/2010/wordprocessingGroup" xmlns:wpi="http://schemas.microsoft.com/office/word/2010/wordprocessingInk" xmlns:wne="http://schemas.microsoft.com/office/word/2006/wordml" xmlns:wps="http://schemas.microsoft.com/office/word/2010/wordprocessingShape" mc:Ignorable="w14 w15 w16se w16cid w16 w16cex w16sdtdh w16sdtfl w16du wp14">
-  <w:p>
-    <w:pPr>
-      <w:pStyle w:val="Footer"/>
-    </w:pPr>
-  </w:p>
-</w:ftr>
-</file>
-
 <file path=word/footnotes.xml><?xml version="1.0" encoding="utf-8"?>
 <w:footnotes xmlns:wpc="http://schemas.microsoft.com/office/word/2010/wordprocessingCanvas" xmlns:cx="http://schemas.microsoft.com/office/drawing/2014/chartex" xmlns:cx1="http://schemas.microsoft.com/office/drawing/2015/9/8/chartex" xmlns:cx2="http://schemas.microsoft.com/office/drawing/2015/10/21/chartex" xmlns:cx3="http://schemas.microsoft.com/office/drawing/2016/5/9/chartex" xmlns:cx4="http://schemas.microsoft.com/office/drawing/2016/5/10/chartex" xmlns:cx5="http://schemas.microsoft.com/office/drawing/2016/5/11/chartex" xmlns:cx6="http://schemas.microsoft.com/office/drawing/2016/5/12/chartex" xmlns:cx7="http://schemas.microsoft.com/office/drawing/2016/5/13/chartex" xmlns:cx8="http://schemas.microsoft.com/office/drawing/2016/5/14/chartex" xmlns:mc="http://schemas.openxmlformats.org/markup-compatibility/2006" xmlns:aink="http://schemas.microsoft.com/office/drawing/2016/ink" xmlns:am3d="http://schemas.microsoft.com/office/drawing/2017/model3d" xmlns:o="urn:schemas-microsoft-com:office:office" xmlns:oel="http://schemas.microsoft.com/office/2019/extlst" xmlns:r="http://schemas.openxmlformats.org/officeDocument/2006/relationships" xmlns:m="http://schemas.openxmlformats.org/officeDocument/2006/math" xmlns:v="urn:schemas-microsoft-com:vml" xmlns:wp14="http://schemas.microsoft.com/office/word/2010/wordprocessingDrawing" xmlns:wp="http://schemas.openxmlformats.org/drawingml/2006/wordprocessingDrawing" xmlns:w10="urn:schemas-microsoft-com:office:word" xmlns:w="http://schemas.openxmlformats.org/wordprocessingml/2006/main" xmlns:w14="http://schemas.microsoft.com/office/word/2010/wordml" xmlns:w15="http://schemas.microsoft.com/office/word/2012/wordml" xmlns:w16cex="http://schemas.microsoft.com/office/word/2018/wordml/cex" xmlns:w16cid="http://schemas.microsoft.com/office/word/2016/wordml/cid" xmlns:w16="http://schemas.microsoft.com/office/word/2018/wordml" xmlns:w16du="http://schemas.microsoft.com/office/word/2023/wordml/word16du" xmlns:w16sdtdh="http://schemas.microsoft.com/office/word/2020/wordml/sdtdatahash" xmlns:w16sdtfl="http://schemas.microsoft.com/office/word/2024/wordml/sdtformatlock" xmlns:w16se="http://schemas.microsoft.com/office/word/2015/wordml/symex" xmlns:wpg="http://schemas.microsoft.com/office/word/2010/wordprocessingGroup" xmlns:wpi="http://schemas.microsoft.com/office/word/2010/wordprocessingInk" xmlns:wne="http://schemas.microsoft.com/office/word/2006/wordml" xmlns:wps="http://schemas.microsoft.com/office/word/2010/wordprocessingShape" mc:Ignorable="w14 w15 w16se w16cid w16 w16cex w16sdtdh w16sdtfl w16du wp14">
   <w:footnote w:type="separator" w:id="-1">
@@ -11204,16 +11240,6 @@
 </file>
 
 <file path=word/header1.xml><?xml version="1.0" encoding="utf-8"?>
-<w:hdr xmlns:wpc="http://schemas.microsoft.com/office/word/2010/wordprocessingCanvas" xmlns:cx="http://schemas.microsoft.com/office/drawing/2014/chartex" xmlns:cx1="http://schemas.microsoft.com/office/drawing/2015/9/8/chartex" xmlns:cx2="http://schemas.microsoft.com/office/drawing/2015/10/21/chartex" xmlns:cx3="http://schemas.microsoft.com/office/drawing/2016/5/9/chartex" xmlns:cx4="http://schemas.microsoft.com/office/drawing/2016/5/10/chartex" xmlns:cx5="http://schemas.microsoft.com/office/drawing/2016/5/11/chartex" xmlns:cx6="http://schemas.microsoft.com/office/drawing/2016/5/12/chartex" xmlns:cx7="http://schemas.microsoft.com/office/drawing/2016/5/13/chartex" xmlns:cx8="http://schemas.microsoft.com/office/drawing/2016/5/14/chartex" xmlns:mc="http://schemas.openxmlformats.org/markup-compatibility/2006" xmlns:aink="http://schemas.microsoft.com/office/drawing/2016/ink" xmlns:am3d="http://schemas.microsoft.com/office/drawing/2017/model3d" xmlns:o="urn:schemas-microsoft-com:office:office" xmlns:oel="http://schemas.microsoft.com/office/2019/extlst" xmlns:r="http://schemas.openxmlformats.org/officeDocument/2006/relationships" xmlns:m="http://schemas.openxmlformats.org/officeDocument/2006/math" xmlns:v="urn:schemas-microsoft-com:vml" xmlns:wp14="http://schemas.microsoft.com/office/word/2010/wordprocessingDrawing" xmlns:wp="http://schemas.openxmlformats.org/drawingml/2006/wordprocessingDrawing" xmlns:w10="urn:schemas-microsoft-com:office:word" xmlns:w="http://schemas.openxmlformats.org/wordprocessingml/2006/main" xmlns:w14="http://schemas.microsoft.com/office/word/2010/wordml" xmlns:w15="http://schemas.microsoft.com/office/word/2012/wordml" xmlns:w16cex="http://schemas.microsoft.com/office/word/2018/wordml/cex" xmlns:w16cid="http://schemas.microsoft.com/office/word/2016/wordml/cid" xmlns:w16="http://schemas.microsoft.com/office/word/2018/wordml" xmlns:w16du="http://schemas.microsoft.com/office/word/2023/wordml/word16du" xmlns:w16sdtdh="http://schemas.microsoft.com/office/word/2020/wordml/sdtdatahash" xmlns:w16sdtfl="http://schemas.microsoft.com/office/word/2024/wordml/sdtformatlock" xmlns:w16se="http://schemas.microsoft.com/office/word/2015/wordml/symex" xmlns:wpg="http://schemas.microsoft.com/office/word/2010/wordprocessingGroup" xmlns:wpi="http://schemas.microsoft.com/office/word/2010/wordprocessingInk" xmlns:wne="http://schemas.microsoft.com/office/word/2006/wordml" xmlns:wps="http://schemas.microsoft.com/office/word/2010/wordprocessingShape" mc:Ignorable="w14 w15 w16se w16cid w16 w16cex w16sdtdh w16sdtfl w16du wp14">
-  <w:p>
-    <w:pPr>
-      <w:pStyle w:val="Header"/>
-    </w:pPr>
-  </w:p>
-</w:hdr>
-</file>
-
-<file path=word/header2.xml><?xml version="1.0" encoding="utf-8"?>
 <w:hdr xmlns:wpc="http://schemas.microsoft.com/office/word/2010/wordprocessingCanvas" xmlns:cx="http://schemas.microsoft.com/office/drawing/2014/chartex" xmlns:cx1="http://schemas.microsoft.com/office/drawing/2015/9/8/chartex" xmlns:cx2="http://schemas.microsoft.com/office/drawing/2015/10/21/chartex" xmlns:cx3="http://schemas.microsoft.com/office/drawing/2016/5/9/chartex" xmlns:cx4="http://schemas.microsoft.com/office/drawing/2016/5/10/chartex" xmlns:cx5="http://schemas.microsoft.com/office/drawing/2016/5/11/chartex" xmlns:cx6="http://schemas.microsoft.com/office/drawing/2016/5/12/chartex" xmlns:cx7="http://schemas.microsoft.com/office/drawing/2016/5/13/chartex" xmlns:cx8="http://schemas.microsoft.com/office/drawing/2016/5/14/chartex" xmlns:mc="http://schemas.openxmlformats.org/markup-compatibility/2006" xmlns:aink="http://schemas.microsoft.com/office/drawing/2016/ink" xmlns:am3d="http://schemas.microsoft.com/office/drawing/2017/model3d" xmlns:o="urn:schemas-microsoft-com:office:office" xmlns:oel="http://schemas.microsoft.com/office/2019/extlst" xmlns:r="http://schemas.openxmlformats.org/officeDocument/2006/relationships" xmlns:m="http://schemas.openxmlformats.org/officeDocument/2006/math" xmlns:v="urn:schemas-microsoft-com:vml" xmlns:wp14="http://schemas.microsoft.com/office/word/2010/wordprocessingDrawing" xmlns:wp="http://schemas.openxmlformats.org/drawingml/2006/wordprocessingDrawing" xmlns:w10="urn:schemas-microsoft-com:office:word" xmlns:w="http://schemas.openxmlformats.org/wordprocessingml/2006/main" xmlns:w14="http://schemas.microsoft.com/office/word/2010/wordml" xmlns:w15="http://schemas.microsoft.com/office/word/2012/wordml" xmlns:w16cex="http://schemas.microsoft.com/office/word/2018/wordml/cex" xmlns:w16cid="http://schemas.microsoft.com/office/word/2016/wordml/cid" xmlns:w16="http://schemas.microsoft.com/office/word/2018/wordml" xmlns:w16du="http://schemas.microsoft.com/office/word/2023/wordml/word16du" xmlns:w16sdtdh="http://schemas.microsoft.com/office/word/2020/wordml/sdtdatahash" xmlns:w16sdtfl="http://schemas.microsoft.com/office/word/2024/wordml/sdtformatlock" xmlns:w16se="http://schemas.microsoft.com/office/word/2015/wordml/symex" xmlns:wpg="http://schemas.microsoft.com/office/word/2010/wordprocessingGroup" xmlns:wpi="http://schemas.microsoft.com/office/word/2010/wordprocessingInk" xmlns:wne="http://schemas.microsoft.com/office/word/2006/wordml" xmlns:wps="http://schemas.microsoft.com/office/word/2010/wordprocessingShape" mc:Ignorable="w14 w15 w16se w16cid w16 w16cex w16sdtdh w16sdtfl w16du wp14">
   <w:tbl>
     <w:tblPr>
@@ -11237,11 +11263,6 @@
         <w:p>
           <w:pPr>
             <w:spacing w:after="0" w:line="240" w:lineRule="auto"/>
-            <w:rPr>
-              <w:rFonts w:ascii="Charter BT" w:eastAsia="Times New Roman" w:hAnsi="Charter BT" w:cs="Times New Roman"/>
-              <w:sz w:val="20"/>
-              <w:szCs w:val="20"/>
-            </w:rPr>
           </w:pPr>
           <w:hyperlink r:id="rId1" w:history="1">
             <w:r>
@@ -11376,17 +11397,53 @@
         </w:p>
       </w:tc>
     </w:tr>
+    <w:tr>
+      <w:trPr>
+        <w:trHeight w:val="178"/>
+      </w:trPr>
+      <w:tc>
+        <w:tcPr>
+          <w:tcW w:w="3494" w:type="dxa"/>
+        </w:tcPr>
+        <w:p>
+          <w:pPr>
+            <w:spacing w:after="0" w:line="240" w:lineRule="auto"/>
+          </w:pPr>
+        </w:p>
+      </w:tc>
+      <w:tc>
+        <w:tcPr>
+          <w:tcW w:w="3355" w:type="dxa"/>
+        </w:tcPr>
+        <w:p>
+          <w:pPr>
+            <w:spacing w:after="0" w:line="240" w:lineRule="auto"/>
+            <w:rPr>
+              <w:rFonts w:ascii="Verdana" w:eastAsia="Times New Roman" w:hAnsi="Verdana" w:cs="Times New Roman"/>
+              <w:smallCaps/>
+            </w:rPr>
+          </w:pPr>
+        </w:p>
+      </w:tc>
+      <w:tc>
+        <w:tcPr>
+          <w:tcW w:w="3182" w:type="dxa"/>
+        </w:tcPr>
+        <w:p>
+          <w:pPr>
+            <w:spacing w:after="0" w:line="240" w:lineRule="auto"/>
+            <w:jc w:val="center"/>
+            <w:rPr>
+              <w:rFonts w:ascii="Verdana" w:eastAsia="Times New Roman" w:hAnsi="Verdana" w:cs="Times New Roman"/>
+              <w:smallCaps/>
+              <w:sz w:val="18"/>
+              <w:szCs w:val="18"/>
+            </w:rPr>
+          </w:pPr>
+        </w:p>
+      </w:tc>
+    </w:tr>
   </w:tbl>
-  <w:p>
-    <w:pPr>
-      <w:pStyle w:val="Header"/>
-    </w:pPr>
-  </w:p>
-</w:hdr>
-</file>
-
-<file path=word/header3.xml><?xml version="1.0" encoding="utf-8"?>
-<w:hdr xmlns:wpc="http://schemas.microsoft.com/office/word/2010/wordprocessingCanvas" xmlns:cx="http://schemas.microsoft.com/office/drawing/2014/chartex" xmlns:cx1="http://schemas.microsoft.com/office/drawing/2015/9/8/chartex" xmlns:cx2="http://schemas.microsoft.com/office/drawing/2015/10/21/chartex" xmlns:cx3="http://schemas.microsoft.com/office/drawing/2016/5/9/chartex" xmlns:cx4="http://schemas.microsoft.com/office/drawing/2016/5/10/chartex" xmlns:cx5="http://schemas.microsoft.com/office/drawing/2016/5/11/chartex" xmlns:cx6="http://schemas.microsoft.com/office/drawing/2016/5/12/chartex" xmlns:cx7="http://schemas.microsoft.com/office/drawing/2016/5/13/chartex" xmlns:cx8="http://schemas.microsoft.com/office/drawing/2016/5/14/chartex" xmlns:mc="http://schemas.openxmlformats.org/markup-compatibility/2006" xmlns:aink="http://schemas.microsoft.com/office/drawing/2016/ink" xmlns:am3d="http://schemas.microsoft.com/office/drawing/2017/model3d" xmlns:o="urn:schemas-microsoft-com:office:office" xmlns:oel="http://schemas.microsoft.com/office/2019/extlst" xmlns:r="http://schemas.openxmlformats.org/officeDocument/2006/relationships" xmlns:m="http://schemas.openxmlformats.org/officeDocument/2006/math" xmlns:v="urn:schemas-microsoft-com:vml" xmlns:wp14="http://schemas.microsoft.com/office/word/2010/wordprocessingDrawing" xmlns:wp="http://schemas.openxmlformats.org/drawingml/2006/wordprocessingDrawing" xmlns:w10="urn:schemas-microsoft-com:office:word" xmlns:w="http://schemas.openxmlformats.org/wordprocessingml/2006/main" xmlns:w14="http://schemas.microsoft.com/office/word/2010/wordml" xmlns:w15="http://schemas.microsoft.com/office/word/2012/wordml" xmlns:w16cex="http://schemas.microsoft.com/office/word/2018/wordml/cex" xmlns:w16cid="http://schemas.microsoft.com/office/word/2016/wordml/cid" xmlns:w16="http://schemas.microsoft.com/office/word/2018/wordml" xmlns:w16du="http://schemas.microsoft.com/office/word/2023/wordml/word16du" xmlns:w16sdtdh="http://schemas.microsoft.com/office/word/2020/wordml/sdtdatahash" xmlns:w16sdtfl="http://schemas.microsoft.com/office/word/2024/wordml/sdtformatlock" xmlns:w16se="http://schemas.microsoft.com/office/word/2015/wordml/symex" xmlns:wpg="http://schemas.microsoft.com/office/word/2010/wordprocessingGroup" xmlns:wpi="http://schemas.microsoft.com/office/word/2010/wordprocessingInk" xmlns:wne="http://schemas.microsoft.com/office/word/2006/wordml" xmlns:wps="http://schemas.microsoft.com/office/word/2010/wordprocessingShape" mc:Ignorable="w14 w15 w16se w16cid w16 w16cex w16sdtdh w16sdtfl w16du wp14">
   <w:p>
     <w:pPr>
       <w:pStyle w:val="Header"/>

</xml_diff>